<commit_message>
Liburua eguneratu: bi egile (Beñat Erezuma eta Elia Revuelta)
PDFa, DOCXa eta azalaren irudia berrituta liburuaren bertsio
berriarekin. Edukia ez da aldatu; egiletza eta kreditu-orria bakarrik.

Co-Authored-By: Claude Opus 5 <noreply@anthropic.com>
</commit_message>
<xml_diff>
--- a/pisa2029/liburua/MAIL-liburua-PISA2029.docx
+++ b/pisa2029/liburua/MAIL-liburua-PISA2029.docx
@@ -101,7 +101,7 @@
           <w:sz w:val="26"/>
           <w:szCs w:val="26"/>
         </w:rPr>
-        <w:t xml:space="preserve">Beñat Erezuma</w:t>
+        <w:t xml:space="preserve">Beñat Erezuma eta Elia Revuelta</w:t>
       </w:r>
     </w:p>
     <w:p>
@@ -140,7 +140,7 @@
         <w:spacing w:before="240"/>
       </w:pPr>
       <w:r>
-        <w:t xml:space="preserve">Egilea: Beñat Erezuma · artifiziala.eus</w:t>
+        <w:t xml:space="preserve">Egileak: Beñat Erezuma eta Elia Revuelta · artifiziala.eus</w:t>
       </w:r>
     </w:p>
     <w:p>
@@ -170,7 +170,7 @@
           <w:sz w:val="18"/>
           <w:szCs w:val="18"/>
         </w:rPr>
-        <w:t xml:space="preserve">Liburu hau adimen artifizialaren laguntza handiarekin idatzi da (Claude Opus 5, Anthropic), egilearen eskariz eta zuzendaritzapean. AAk testu-zirriborroak, taulak eta ariketen azalpenak sortu ditu. Egileak zehaztu ditu proiektua, egitura, ikuspegi pedagogikoa, euskarazko terminologia eta argitaratzeko erabakia, eta eduki osoa berrikusi eta egiaztatu du ELGAren eta Europar Batasunaren jatorrizko dokumentuen kontra. Liburu honetako irizpideen arabera (14. kapitulua), erabilera hau 4. maila da: AA oso-osorik, giza gainbegiratzearekin. Giza ekarpen sortzaileari dagozkion eskubideak egilearenak dira.</w:t>
+        <w:t xml:space="preserve">Liburu hau adimen artifizialaren laguntza handiarekin idatzi da (Claude Opus 5, Anthropic), egileen eskariz eta zuzendaritzapean. AAk testu-zirriborroak, taulak eta ariketen azalpenak sortu ditu. Egileek zehaztu dituzte proiektua, egitura, ikuspegi pedagogikoa, euskarazko terminologia eta argitaratzeko erabakia, eta eduki osoa berrikusi eta egiaztatu dute ELGAren eta Europar Batasunaren jatorrizko dokumentuen kontra. Liburu honetako irizpideen arabera (14. kapitulua), erabilera hau 4. maila da: AA oso-osorik, giza gainbegiratzearekin. Giza ekarpen sortzaileari dagozkion eskubideak egileenak dira.</w:t>
       </w:r>
     </w:p>
     <w:p>
@@ -189,7 +189,7 @@
           <w:sz w:val="20"/>
           <w:szCs w:val="20"/>
         </w:rPr>
-        <w:t xml:space="preserve">Erabili, egokitu eta partekatu hezkuntza-helburuekin, egilea aipatuz eta lizentzia bera mantenduz.</w:t>
+        <w:t xml:space="preserve">Erabili, egokitu eta partekatu hezkuntza-helburuekin, egileak aipatuz eta lizentzia bera mantenduz.</w:t>
       </w:r>
     </w:p>
     <w:p>

</xml_diff>